<commit_message>
Translate first 20 problems of 9math2023 into Uzbek
Co-Authored-By: Claude Sonnet 5.5 <noreply@anthropic.com>
Claude-Session: https://claude.ai/code/session_014ETybXUi8eDnMihWbVFFBS
</commit_message>
<xml_diff>
--- a/9math2023_uz_boshlanishi.docx
+++ b/9math2023_uz_boshlanishi.docx
@@ -432,13 +432,13 @@
       </w:r>
     </w:p>
     <w:bookmarkEnd w:id="10"/>
-    <w:bookmarkStart w:id="14" w:name="bob.-butun-sonlar"/>
+    <w:bookmarkStart w:id="14" w:name="Xbbac09c2d605207b74056297164d1ab4cafa97f"/>
     <w:p>
       <w:pPr>
         <w:pStyle w:val="Heading1"/>
       </w:pPr>
       <w:r>
-        <w:t xml:space="preserve">1-bob. Butun sonlar</w:t>
+        <w:t xml:space="preserve">1-bob. Butun sonlar — dastlabki 20 ta masala (tarjima)</w:t>
       </w:r>
     </w:p>
     <w:bookmarkStart w:id="11" w:name="onlik-yozuv"/>
@@ -453,18 +453,6 @@
     <w:p>
       <w:pPr>
         <w:pStyle w:val="FirstParagraph"/>
-      </w:pPr>
-      <w:r>
-        <w:rPr>
-          <w:b/>
-          <w:bCs/>
-        </w:rPr>
-        <w:t xml:space="preserve">Namunaviy masalalar (tarjima):</w:t>
-      </w:r>
-    </w:p>
-    <w:p>
-      <w:pPr>
-        <w:pStyle w:val="BodyText"/>
       </w:pPr>
       <w:r>
         <w:rPr>
@@ -477,7 +465,7 @@
         <w:t xml:space="preserve"> </w:t>
       </w:r>
       <w:r>
-        <w:t xml:space="preserve">Besh xonali sondan bitta raqam o’chirildi va hosil bo’lgan to’rt xonali son dastlabki son bilan qo’shildi. Yig’indi</w:t>
+        <w:t xml:space="preserve">(«Kelajak tadqiqotchilari — fan kelajagi», 2015, 9.1) Besh xonali sondan bitta raqam o’chirildi va hosil bo’lgan to’rt xonali son dastlabki son bilan qo’shildi. Yig’indi</w:t>
       </w:r>
       <w:r>
         <w:t xml:space="preserve"> </w:t>
@@ -498,6 +486,80 @@
       </w:r>
       <w:r>
         <w:t xml:space="preserve">ga teng chiqdi. Dastlabki sonni toping.</w:t>
+      </w:r>
+    </w:p>
+    <w:p>
+      <w:pPr>
+        <w:pStyle w:val="BodyText"/>
+      </w:pPr>
+      <w:r>
+        <w:rPr>
+          <w:b/>
+          <w:bCs/>
+        </w:rPr>
+        <w:t xml:space="preserve">1.1.2.</w:t>
+      </w:r>
+      <w:r>
+        <w:t xml:space="preserve"> </w:t>
+      </w:r>
+      <w:r>
+        <w:t xml:space="preserve">(«Belchonok», 2022, 9.1) Ikki sonning yig’indisi</w:t>
+      </w:r>
+      <w:r>
+        <w:t xml:space="preserve"> </w:t>
+      </w:r>
+      <m:oMath>
+        <m:r>
+          <m:t>2022</m:t>
+        </m:r>
+      </m:oMath>
+      <w:r>
+        <w:t xml:space="preserve"> </w:t>
+      </w:r>
+      <w:r>
+        <w:t xml:space="preserve">ga teng. Agar birinchi sonning oxirgi raqami</w:t>
+      </w:r>
+      <w:r>
+        <w:t xml:space="preserve"> </w:t>
+      </w:r>
+      <m:oMath>
+        <m:r>
+          <m:t>5</m:t>
+        </m:r>
+      </m:oMath>
+      <w:r>
+        <w:t xml:space="preserve"> </w:t>
+      </w:r>
+      <w:r>
+        <w:t xml:space="preserve">ni o’chirib, ikkinchi sonning o’ng tomoniga</w:t>
+      </w:r>
+      <w:r>
+        <w:t xml:space="preserve"> </w:t>
+      </w:r>
+      <m:oMath>
+        <m:r>
+          <m:t>1</m:t>
+        </m:r>
+      </m:oMath>
+      <w:r>
+        <w:t xml:space="preserve"> </w:t>
+      </w:r>
+      <w:r>
+        <w:t xml:space="preserve">raqamini yozsak, o’zgargan sonlarning yig’indisi</w:t>
+      </w:r>
+      <w:r>
+        <w:t xml:space="preserve"> </w:t>
+      </w:r>
+      <m:oMath>
+        <m:r>
+          <m:t>2252</m:t>
+        </m:r>
+      </m:oMath>
+      <w:r>
+        <w:t xml:space="preserve"> </w:t>
+      </w:r>
+      <w:r>
+        <w:t xml:space="preserve">bo’ladi. Dastlabki sonlarni toping.</w:t>
       </w:r>
     </w:p>
     <w:p>
@@ -515,7 +577,7 @@
         <w:t xml:space="preserve"> </w:t>
       </w:r>
       <w:r>
-        <w:t xml:space="preserve">Raqamlari ko’paytmasi</w:t>
+        <w:t xml:space="preserve">(Butunrossiya, 2021, MB, 9.1) Raqamlarining ko’paytmasi</w:t>
       </w:r>
       <w:r>
         <w:t xml:space="preserve"> </w:t>
@@ -530,6 +592,272 @@
       </w:r>
       <w:r>
         <w:t xml:space="preserve">ga teng bo’lgan eng katta besh xonali sonni toping.</w:t>
+      </w:r>
+    </w:p>
+    <w:p>
+      <w:pPr>
+        <w:pStyle w:val="BodyText"/>
+      </w:pPr>
+      <w:r>
+        <w:rPr>
+          <w:b/>
+          <w:bCs/>
+        </w:rPr>
+        <w:t xml:space="preserve">1.1.4.</w:t>
+      </w:r>
+      <w:r>
+        <w:t xml:space="preserve"> </w:t>
+      </w:r>
+      <w:r>
+        <w:t xml:space="preserve">(Ochiq olimpiada, 2020, 9.1) Barcha raqamlari turlicha bo’lgan va</w:t>
+      </w:r>
+      <w:r>
+        <w:t xml:space="preserve"> </w:t>
+      </w:r>
+      <m:oMath>
+        <m:r>
+          <m:t>37</m:t>
+        </m:r>
+      </m:oMath>
+      <w:r>
+        <w:t xml:space="preserve"> </w:t>
+      </w:r>
+      <w:r>
+        <w:t xml:space="preserve">ga bo’linadigan sonni «yaxshi» deymiz. Yaxshi uch xonali sonlar sonini toping.</w:t>
+      </w:r>
+    </w:p>
+    <w:p>
+      <w:pPr>
+        <w:pStyle w:val="BodyText"/>
+      </w:pPr>
+      <w:r>
+        <w:rPr>
+          <w:b/>
+          <w:bCs/>
+        </w:rPr>
+        <w:t xml:space="preserve">1.1.5.</w:t>
+      </w:r>
+      <w:r>
+        <w:t xml:space="preserve"> </w:t>
+      </w:r>
+      <w:r>
+        <w:t xml:space="preserve">(Butunsibir, 2022, 9.1)</w:t>
+      </w:r>
+      <w:r>
+        <w:t xml:space="preserve"> </w:t>
+      </w:r>
+      <m:oMath>
+        <m:bar>
+          <m:barPr>
+            <m:pos m:val="top"/>
+          </m:barPr>
+          <m:e>
+            <m:r>
+              <m:t>a</m:t>
+            </m:r>
+            <m:r>
+              <m:t>b</m:t>
+            </m:r>
+            <m:r>
+              <m:t>c</m:t>
+            </m:r>
+            <m:r>
+              <m:t>d</m:t>
+            </m:r>
+          </m:e>
+        </m:bar>
+      </m:oMath>
+      <w:r>
+        <w:t xml:space="preserve"> </w:t>
+      </w:r>
+      <w:r>
+        <w:t xml:space="preserve">to’rt xonali sonni, agar</w:t>
+      </w:r>
+      <w:r>
+        <w:t xml:space="preserve"> </w:t>
+      </w:r>
+      <m:oMath>
+        <m:bar>
+          <m:barPr>
+            <m:pos m:val="top"/>
+          </m:barPr>
+          <m:e>
+            <m:r>
+              <m:t>a</m:t>
+            </m:r>
+            <m:r>
+              <m:t>b</m:t>
+            </m:r>
+          </m:e>
+        </m:bar>
+      </m:oMath>
+      <w:r>
+        <w:t xml:space="preserve"> </w:t>
+      </w:r>
+      <w:r>
+        <w:t xml:space="preserve">va</w:t>
+      </w:r>
+      <w:r>
+        <w:t xml:space="preserve"> </w:t>
+      </w:r>
+      <m:oMath>
+        <m:bar>
+          <m:barPr>
+            <m:pos m:val="top"/>
+          </m:barPr>
+          <m:e>
+            <m:r>
+              <m:t>c</m:t>
+            </m:r>
+            <m:r>
+              <m:t>d</m:t>
+            </m:r>
+          </m:e>
+        </m:bar>
+      </m:oMath>
+      <w:r>
+        <w:t xml:space="preserve"> </w:t>
+      </w:r>
+      <w:r>
+        <w:t xml:space="preserve">ikki xonali sonlarning yig’indisi</w:t>
+      </w:r>
+      <w:r>
+        <w:t xml:space="preserve"> </w:t>
+      </w:r>
+      <m:oMath>
+        <m:bar>
+          <m:barPr>
+            <m:pos m:val="top"/>
+          </m:barPr>
+          <m:e>
+            <m:r>
+              <m:t>b</m:t>
+            </m:r>
+            <m:r>
+              <m:t>c</m:t>
+            </m:r>
+          </m:e>
+        </m:bar>
+      </m:oMath>
+      <w:r>
+        <w:t xml:space="preserve"> </w:t>
+      </w:r>
+      <w:r>
+        <w:t xml:space="preserve">ikki xonali songa teng bo’lsa, «qiziq» deymiz. Masalan,</w:t>
+      </w:r>
+      <w:r>
+        <w:t xml:space="preserve"> </w:t>
+      </w:r>
+      <m:oMath>
+        <m:r>
+          <m:t>1978</m:t>
+        </m:r>
+      </m:oMath>
+      <w:r>
+        <w:t xml:space="preserve"> </w:t>
+      </w:r>
+      <w:r>
+        <w:t xml:space="preserve">qiziq son, chunki</w:t>
+      </w:r>
+      <w:r>
+        <w:t xml:space="preserve"> </w:t>
+      </w:r>
+      <m:oMath>
+        <m:r>
+          <m:t>19</m:t>
+        </m:r>
+        <m:r>
+          <m:rPr>
+            <m:sty m:val="p"/>
+          </m:rPr>
+          <m:t>+</m:t>
+        </m:r>
+        <m:r>
+          <m:t>78</m:t>
+        </m:r>
+        <m:r>
+          <m:rPr>
+            <m:sty m:val="p"/>
+          </m:rPr>
+          <m:t>=</m:t>
+        </m:r>
+        <m:r>
+          <m:t>97</m:t>
+        </m:r>
+      </m:oMath>
+      <w:r>
+        <w:t xml:space="preserve">. Qiziq sonlar sonini toping.</w:t>
+      </w:r>
+    </w:p>
+    <w:p>
+      <w:pPr>
+        <w:pStyle w:val="BodyText"/>
+      </w:pPr>
+      <w:r>
+        <w:rPr>
+          <w:b/>
+          <w:bCs/>
+        </w:rPr>
+        <w:t xml:space="preserve">1.1.6.</w:t>
+      </w:r>
+      <w:r>
+        <w:t xml:space="preserve"> </w:t>
+      </w:r>
+      <w:r>
+        <w:t xml:space="preserve">(KFU olimpiadasi, 2020, 9.2)</w:t>
+      </w:r>
+      <w:r>
+        <w:t xml:space="preserve"> </w:t>
+      </w:r>
+      <m:oMath>
+        <m:f>
+          <m:fPr>
+            <m:type m:val="bar"/>
+          </m:fPr>
+          <m:num>
+            <m:sSup>
+              <m:e>
+                <m:r>
+                  <m:t>10</m:t>
+                </m:r>
+              </m:e>
+              <m:sup>
+                <m:r>
+                  <m:t>120</m:t>
+                </m:r>
+              </m:sup>
+            </m:sSup>
+          </m:num>
+          <m:den>
+            <m:sSup>
+              <m:e>
+                <m:r>
+                  <m:t>10</m:t>
+                </m:r>
+              </m:e>
+              <m:sup>
+                <m:r>
+                  <m:t>5</m:t>
+                </m:r>
+              </m:sup>
+            </m:sSup>
+            <m:r>
+              <m:rPr>
+                <m:sty m:val="p"/>
+              </m:rPr>
+              <m:t>+</m:t>
+            </m:r>
+            <m:r>
+              <m:t>1</m:t>
+            </m:r>
+          </m:den>
+        </m:f>
+      </m:oMath>
+      <w:r>
+        <w:t xml:space="preserve"> </w:t>
+      </w:r>
+      <w:r>
+        <w:t xml:space="preserve">sonning o’nlik yozuvida verguldan oldingi oxirgi ikki raqamni (birlar va o’nlar xonasini) toping.</w:t>
       </w:r>
     </w:p>
     <w:p>
@@ -546,6 +874,37 @@
       <w:r>
         <w:t xml:space="preserve"> </w:t>
       </w:r>
+      <w:r>
+        <w:t xml:space="preserve">(«Missiya bajariladi. Kasbing — moliyachi!», 2023, 8–9.3) O’nlik yozuvi</w:t>
+      </w:r>
+      <w:r>
+        <w:t xml:space="preserve"> </w:t>
+      </w:r>
+      <m:oMath>
+        <m:r>
+          <m:t>500</m:t>
+        </m:r>
+      </m:oMath>
+      <w:r>
+        <w:t xml:space="preserve"> </w:t>
+      </w:r>
+      <w:r>
+        <w:t xml:space="preserve">ta nol bilan tugaydigan eng kichik natural</w:t>
+      </w:r>
+      <w:r>
+        <w:t xml:space="preserve"> </w:t>
+      </w:r>
+      <m:oMath>
+        <m:r>
+          <m:t>n</m:t>
+        </m:r>
+      </m:oMath>
+      <w:r>
+        <w:t xml:space="preserve"> </w:t>
+      </w:r>
+      <w:r>
+        <w:t xml:space="preserve">ni toping. (</w:t>
+      </w:r>
       <m:oMath>
         <m:r>
           <m:t>n</m:t>
@@ -556,44 +915,775 @@
           </m:rPr>
           <m:t>!</m:t>
         </m:r>
-      </m:oMath>
-      <w:r>
-        <w:t xml:space="preserve"> </w:t>
-      </w:r>
-      <w:r>
-        <w:t xml:space="preserve">ning o’nlik yozuvi</w:t>
-      </w:r>
-      <w:r>
-        <w:t xml:space="preserve"> </w:t>
-      </w:r>
-      <m:oMath>
-        <m:r>
-          <m:t>500</m:t>
-        </m:r>
-      </m:oMath>
-      <w:r>
-        <w:t xml:space="preserve"> </w:t>
-      </w:r>
-      <w:r>
-        <w:t xml:space="preserve">ta nol bilan tugaydigan eng kichik natural</w:t>
-      </w:r>
-      <w:r>
-        <w:t xml:space="preserve"> </w:t>
-      </w:r>
-      <m:oMath>
+        <m:r>
+          <m:rPr>
+            <m:sty m:val="p"/>
+          </m:rPr>
+          <m:t>=</m:t>
+        </m:r>
+        <m:r>
+          <m:t>1</m:t>
+        </m:r>
+        <m:r>
+          <m:rPr>
+            <m:sty m:val="p"/>
+          </m:rPr>
+          <m:t>⋅</m:t>
+        </m:r>
+        <m:r>
+          <m:t>2</m:t>
+        </m:r>
+        <m:r>
+          <m:rPr>
+            <m:sty m:val="p"/>
+          </m:rPr>
+          <m:t>⋅</m:t>
+        </m:r>
+        <m:r>
+          <m:t>3</m:t>
+        </m:r>
+        <m:r>
+          <m:rPr>
+            <m:sty m:val="p"/>
+          </m:rPr>
+          <m:t>⋯</m:t>
+        </m:r>
+        <m:r>
+          <m:rPr>
+            <m:sty m:val="p"/>
+          </m:rPr>
+          <m:t>(</m:t>
+        </m:r>
         <m:r>
           <m:t>n</m:t>
         </m:r>
-      </m:oMath>
-      <w:r>
-        <w:t xml:space="preserve"> </w:t>
-      </w:r>
-      <w:r>
-        <w:t xml:space="preserve">ni toping. (</w:t>
-      </w:r>
-      <m:oMath>
+        <m:r>
+          <m:rPr>
+            <m:sty m:val="p"/>
+          </m:rPr>
+          <m:t>−</m:t>
+        </m:r>
+        <m:r>
+          <m:t>1</m:t>
+        </m:r>
+        <m:r>
+          <m:rPr>
+            <m:sty m:val="p"/>
+          </m:rPr>
+          <m:t>)</m:t>
+        </m:r>
+        <m:r>
+          <m:rPr>
+            <m:sty m:val="p"/>
+          </m:rPr>
+          <m:t>⋅</m:t>
+        </m:r>
         <m:r>
           <m:t>n</m:t>
+        </m:r>
+      </m:oMath>
+      <w:r>
+        <w:t xml:space="preserve">)</w:t>
+      </w:r>
+    </w:p>
+    <w:p>
+      <w:pPr>
+        <w:pStyle w:val="BodyText"/>
+      </w:pPr>
+      <w:r>
+        <w:rPr>
+          <w:b/>
+          <w:bCs/>
+        </w:rPr>
+        <w:t xml:space="preserve">1.1.8.</w:t>
+      </w:r>
+      <w:r>
+        <w:t xml:space="preserve"> </w:t>
+      </w:r>
+      <w:r>
+        <w:t xml:space="preserve">(«Rosatom», 2021, 9.3) Qanday natural</w:t>
+      </w:r>
+      <w:r>
+        <w:t xml:space="preserve"> </w:t>
+      </w:r>
+      <m:oMath>
+        <m:r>
+          <m:t>n</m:t>
+        </m:r>
+      </m:oMath>
+      <w:r>
+        <w:t xml:space="preserve"> </w:t>
+      </w:r>
+      <w:r>
+        <w:t xml:space="preserve">larda</w:t>
+      </w:r>
+      <w:r>
+        <w:t xml:space="preserve"> </w:t>
+      </w:r>
+      <m:oMath>
+        <m:f>
+          <m:fPr>
+            <m:type m:val="bar"/>
+          </m:fPr>
+          <m:num>
+            <m:r>
+              <m:t>2</m:t>
+            </m:r>
+          </m:num>
+          <m:den>
+            <m:r>
+              <m:t>n</m:t>
+            </m:r>
+          </m:den>
+        </m:f>
+      </m:oMath>
+      <w:r>
+        <w:t xml:space="preserve"> </w:t>
+      </w:r>
+      <w:r>
+        <w:t xml:space="preserve">kasrni</w:t>
+      </w:r>
+      <w:r>
+        <w:t xml:space="preserve"> </w:t>
+      </w:r>
+      <m:oMath>
+        <m:r>
+          <m:t>0</m:t>
+        </m:r>
+        <m:r>
+          <m:rPr>
+            <m:sty m:val="p"/>
+          </m:rPr>
+          <m:t>,</m:t>
+        </m:r>
+        <m:r>
+          <m:t>1</m:t>
+        </m:r>
+        <m:r>
+          <m:rPr>
+            <m:sty m:val="p"/>
+          </m:rPr>
+          <m:t>(</m:t>
+        </m:r>
+        <m:sSub>
+          <m:e>
+            <m:r>
+              <m:t>a</m:t>
+            </m:r>
+          </m:e>
+          <m:sub>
+            <m:r>
+              <m:t>1</m:t>
+            </m:r>
+          </m:sub>
+        </m:sSub>
+        <m:sSub>
+          <m:e>
+            <m:r>
+              <m:t>a</m:t>
+            </m:r>
+          </m:e>
+          <m:sub>
+            <m:r>
+              <m:t>2</m:t>
+            </m:r>
+          </m:sub>
+        </m:sSub>
+        <m:r>
+          <m:rPr>
+            <m:sty m:val="p"/>
+          </m:rPr>
+          <m:t>)</m:t>
+        </m:r>
+      </m:oMath>
+      <w:r>
+        <w:t xml:space="preserve"> </w:t>
+      </w:r>
+      <w:r>
+        <w:t xml:space="preserve">ko’rinishidagi, davri ikki xil raqamdan iborat davriy o’nli kasr shaklida yozish mumkin?</w:t>
+      </w:r>
+    </w:p>
+    <w:p>
+      <w:pPr>
+        <w:pStyle w:val="BodyText"/>
+      </w:pPr>
+      <w:r>
+        <w:rPr>
+          <w:b/>
+          <w:bCs/>
+        </w:rPr>
+        <w:t xml:space="preserve">1.1.9.</w:t>
+      </w:r>
+      <w:r>
+        <w:t xml:space="preserve"> </w:t>
+      </w:r>
+      <w:r>
+        <w:t xml:space="preserve">(«Birlik formulasi / Uchinchi ming yillik», 2016, 9.3) Besh xonali son Lidiyaga yoqadi, agar uning yozuvidagi birorta raqam</w:t>
+      </w:r>
+      <w:r>
+        <w:t xml:space="preserve"> </w:t>
+      </w:r>
+      <m:oMath>
+        <m:r>
+          <m:t>3</m:t>
+        </m:r>
+      </m:oMath>
+      <w:r>
+        <w:t xml:space="preserve"> </w:t>
+      </w:r>
+      <w:r>
+        <w:t xml:space="preserve">ga bo’linmasa. Lidiyaga yoqadigan barcha besh xonali sonlar raqamlarining umumiy yig’indisini toping.</w:t>
+      </w:r>
+    </w:p>
+    <w:p>
+      <w:pPr>
+        <w:pStyle w:val="BodyText"/>
+      </w:pPr>
+      <w:r>
+        <w:rPr>
+          <w:b/>
+          <w:bCs/>
+        </w:rPr>
+        <w:t xml:space="preserve">1.1.10.</w:t>
+      </w:r>
+      <w:r>
+        <w:t xml:space="preserve"> </w:t>
+      </w:r>
+      <w:r>
+        <w:t xml:space="preserve">(«Kurchatov», 2021, 9.3) Besh xonali sonning har bir raqamini</w:t>
+      </w:r>
+      <w:r>
+        <w:t xml:space="preserve"> </w:t>
+      </w:r>
+      <m:oMath>
+        <m:r>
+          <m:t>2</m:t>
+        </m:r>
+      </m:oMath>
+      <w:r>
+        <w:t xml:space="preserve"> </w:t>
+      </w:r>
+      <w:r>
+        <w:t xml:space="preserve">ga yoki</w:t>
+      </w:r>
+      <w:r>
+        <w:t xml:space="preserve"> </w:t>
+      </w:r>
+      <m:oMath>
+        <m:r>
+          <m:t>4</m:t>
+        </m:r>
+      </m:oMath>
+      <w:r>
+        <w:t xml:space="preserve"> </w:t>
+      </w:r>
+      <w:r>
+        <w:t xml:space="preserve">ga oshirishdi (turli raqamlar turlicha oshirilishi mumkin), natijada son to’rt marta ortdi. Dastlabki son qanday bo’lishi mumkin? Barcha variantlarni toping va boshqa variant yo’qligini isbotlang.</w:t>
+      </w:r>
+    </w:p>
+    <w:p>
+      <w:pPr>
+        <w:pStyle w:val="BodyText"/>
+      </w:pPr>
+      <w:r>
+        <w:rPr>
+          <w:b/>
+          <w:bCs/>
+        </w:rPr>
+        <w:t xml:space="preserve">1.1.11.</w:t>
+      </w:r>
+      <w:r>
+        <w:t xml:space="preserve"> </w:t>
+      </w:r>
+      <w:r>
+        <w:t xml:space="preserve">(«Missiya bajariladi. Kasbing — moliyachi!», 2017, 8–9.4) Raqamlari ko’paytmasi</w:t>
+      </w:r>
+      <w:r>
+        <w:t xml:space="preserve"> </w:t>
+      </w:r>
+      <m:oMath>
+        <m:r>
+          <m:t>5120</m:t>
+        </m:r>
+      </m:oMath>
+      <w:r>
+        <w:t xml:space="preserve"> </w:t>
+      </w:r>
+      <w:r>
+        <w:t xml:space="preserve">ga teng bo’lgan eng kichik musbat butun sonni toping.</w:t>
+      </w:r>
+    </w:p>
+    <w:p>
+      <w:pPr>
+        <w:pStyle w:val="BodyText"/>
+      </w:pPr>
+      <w:r>
+        <w:rPr>
+          <w:b/>
+          <w:bCs/>
+        </w:rPr>
+        <w:t xml:space="preserve">1.1.12.</w:t>
+      </w:r>
+      <w:r>
+        <w:t xml:space="preserve"> </w:t>
+      </w:r>
+      <w:r>
+        <w:t xml:space="preserve">(«Belchonok», 2020, 9.4)</w:t>
+      </w:r>
+      <w:r>
+        <w:t xml:space="preserve"> </w:t>
+      </w:r>
+      <m:oMath>
+        <m:r>
+          <m:t>100</m:t>
+        </m:r>
+        <m:r>
+          <m:t> </m:t>
+        </m:r>
+        <m:r>
+          <m:t>000</m:t>
+        </m:r>
+      </m:oMath>
+      <w:r>
+        <w:t xml:space="preserve"> </w:t>
+      </w:r>
+      <w:r>
+        <w:t xml:space="preserve">dan kichik son o’sha raqamlar teskari tartibda yozilgan sondan</w:t>
+      </w:r>
+      <w:r>
+        <w:t xml:space="preserve"> </w:t>
+      </w:r>
+      <m:oMath>
+        <m:r>
+          <m:t>6363</m:t>
+        </m:r>
+      </m:oMath>
+      <w:r>
+        <w:t xml:space="preserve"> </w:t>
+      </w:r>
+      <w:r>
+        <w:t xml:space="preserve">ga katta. Barcha shunday sonlarni toping.</w:t>
+      </w:r>
+    </w:p>
+    <w:p>
+      <w:pPr>
+        <w:pStyle w:val="BodyText"/>
+      </w:pPr>
+      <w:r>
+        <w:rPr>
+          <w:b/>
+          <w:bCs/>
+        </w:rPr>
+        <w:t xml:space="preserve">1.1.13.</w:t>
+      </w:r>
+      <w:r>
+        <w:t xml:space="preserve"> </w:t>
+      </w:r>
+      <w:r>
+        <w:t xml:space="preserve">(«Belchonok», 2020, 9.4) O’sha raqamlar teskari tartibda yozilgan songa karrali, lekin unga teng bo’lmagan barcha toq to’rt xonali sonlarni toping.</w:t>
+      </w:r>
+    </w:p>
+    <w:p>
+      <w:pPr>
+        <w:pStyle w:val="BodyText"/>
+      </w:pPr>
+      <w:r>
+        <w:rPr>
+          <w:b/>
+          <w:bCs/>
+        </w:rPr>
+        <w:t xml:space="preserve">1.1.14.</w:t>
+      </w:r>
+      <w:r>
+        <w:t xml:space="preserve"> </w:t>
+      </w:r>
+      <w:r>
+        <w:t xml:space="preserve">(«Missiya bajariladi. Kasbing — moliyachi!», 2016, 8–9.7) Bank hisoblarini tahlil qilganda, har birida mablag’</w:t>
+      </w:r>
+      <w:r>
+        <w:t xml:space="preserve"> </w:t>
+      </w:r>
+      <m:oMath>
+        <m:r>
+          <m:t>10</m:t>
+        </m:r>
+      </m:oMath>
+      <w:r>
+        <w:t xml:space="preserve"> </w:t>
+      </w:r>
+      <w:r>
+        <w:t xml:space="preserve">rubldan ko’p ekani aniqlandi. Shuningdek, hisobida bir xil summa bo’lgan mijozlar guruhi topildi, bu summa faqat birlardan iborat son. Shu guruh hisoblaridagi barcha mablag’lar yig’indisi ham faqat birlardan iborat son bilan ifodalanadi. Guruhda bir kishidan ko’p bo’lsa, bu guruhdagi mijozlarning eng kam soni nechta bo’lishi mumkin?</w:t>
+      </w:r>
+    </w:p>
+    <w:bookmarkEnd w:id="11"/>
+    <w:bookmarkStart w:id="12" w:name="raqamlar-yigindisi"/>
+    <w:p>
+      <w:pPr>
+        <w:pStyle w:val="Heading2"/>
+      </w:pPr>
+      <w:r>
+        <w:t xml:space="preserve">1.2 Raqamlar yig’indisi</w:t>
+      </w:r>
+    </w:p>
+    <w:p>
+      <w:pPr>
+        <w:pStyle w:val="FirstParagraph"/>
+      </w:pPr>
+      <w:r>
+        <w:rPr>
+          <w:b/>
+          <w:bCs/>
+        </w:rPr>
+        <w:t xml:space="preserve">1.2.1.</w:t>
+      </w:r>
+      <w:r>
+        <w:t xml:space="preserve"> </w:t>
+      </w:r>
+      <w:r>
+        <w:t xml:space="preserve">(Butunsibir, 2016, 9.1)</w:t>
+      </w:r>
+      <w:r>
+        <w:t xml:space="preserve"> </w:t>
+      </w:r>
+      <m:oMath>
+        <m:r>
+          <m:t>A</m:t>
+        </m:r>
+      </m:oMath>
+      <w:r>
+        <w:t xml:space="preserve"> </w:t>
+      </w:r>
+      <w:r>
+        <w:t xml:space="preserve">sonning raqamlari yig’indisi</w:t>
+      </w:r>
+      <w:r>
+        <w:t xml:space="preserve"> </w:t>
+      </w:r>
+      <m:oMath>
+        <m:r>
+          <m:t>59</m:t>
+        </m:r>
+      </m:oMath>
+      <w:r>
+        <w:t xml:space="preserve">,</w:t>
+      </w:r>
+      <w:r>
+        <w:t xml:space="preserve"> </w:t>
+      </w:r>
+      <m:oMath>
+        <m:r>
+          <m:t>B</m:t>
+        </m:r>
+      </m:oMath>
+      <w:r>
+        <w:t xml:space="preserve"> </w:t>
+      </w:r>
+      <w:r>
+        <w:t xml:space="preserve">sonniki</w:t>
+      </w:r>
+      <w:r>
+        <w:t xml:space="preserve"> </w:t>
+      </w:r>
+      <m:oMath>
+        <m:r>
+          <m:t>77</m:t>
+        </m:r>
+      </m:oMath>
+      <w:r>
+        <w:t xml:space="preserve"> </w:t>
+      </w:r>
+      <w:r>
+        <w:t xml:space="preserve">ekani ma’lum.</w:t>
+      </w:r>
+      <w:r>
+        <w:t xml:space="preserve"> </w:t>
+      </w:r>
+      <m:oMath>
+        <m:r>
+          <m:t>A</m:t>
+        </m:r>
+        <m:r>
+          <m:rPr>
+            <m:sty m:val="p"/>
+          </m:rPr>
+          <m:t>+</m:t>
+        </m:r>
+        <m:r>
+          <m:t>B</m:t>
+        </m:r>
+      </m:oMath>
+      <w:r>
+        <w:t xml:space="preserve"> </w:t>
+      </w:r>
+      <w:r>
+        <w:t xml:space="preserve">sonning raqamlari yig’indisi eng kamida nechaga teng bo’lishi mumkin?</w:t>
+      </w:r>
+    </w:p>
+    <w:p>
+      <w:pPr>
+        <w:pStyle w:val="BodyText"/>
+      </w:pPr>
+      <w:r>
+        <w:rPr>
+          <w:b/>
+          <w:bCs/>
+        </w:rPr>
+        <w:t xml:space="preserve">1.2.2.</w:t>
+      </w:r>
+      <w:r>
+        <w:t xml:space="preserve"> </w:t>
+      </w:r>
+      <w:r>
+        <w:t xml:space="preserve">(Butunsibir, 2017, 9.3)</w:t>
+      </w:r>
+      <w:r>
+        <w:t xml:space="preserve"> </w:t>
+      </w:r>
+      <m:oMath>
+        <m:r>
+          <m:t>2017</m:t>
+        </m:r>
+      </m:oMath>
+      <w:r>
+        <w:t xml:space="preserve"> </w:t>
+      </w:r>
+      <w:r>
+        <w:t xml:space="preserve">ni ikki natural son yig’indisi ko’rinishida ifodalash mumkinmi, bunda ulardan birining raqamlari yig’indisi ikkinchisinikidan ikki marta katta bo’lsin?</w:t>
+      </w:r>
+    </w:p>
+    <w:p>
+      <w:pPr>
+        <w:pStyle w:val="BodyText"/>
+      </w:pPr>
+      <w:r>
+        <w:rPr>
+          <w:b/>
+          <w:bCs/>
+        </w:rPr>
+        <w:t xml:space="preserve">1.2.3.</w:t>
+      </w:r>
+      <w:r>
+        <w:t xml:space="preserve"> </w:t>
+      </w:r>
+      <w:r>
+        <w:t xml:space="preserve">(«Missiya bajariladi. Kasbing — moliyachi!», 2022, 8–9.5) Har qanday natural</w:t>
+      </w:r>
+      <w:r>
+        <w:t xml:space="preserve"> </w:t>
+      </w:r>
+      <m:oMath>
+        <m:r>
+          <m:t>n</m:t>
+        </m:r>
+      </m:oMath>
+      <w:r>
+        <w:t xml:space="preserve"> </w:t>
+      </w:r>
+      <w:r>
+        <w:t xml:space="preserve">uchun o’zining raqamlari yig’indisidan</w:t>
+      </w:r>
+      <w:r>
+        <w:t xml:space="preserve"> </w:t>
+      </w:r>
+      <m:oMath>
+        <m:limLow>
+          <m:e>
+            <m:limLow>
+              <m:e>
+                <m:r>
+                  <m:t>11</m:t>
+                </m:r>
+                <m:r>
+                  <m:rPr>
+                    <m:sty m:val="p"/>
+                  </m:rPr>
+                  <m:t>…</m:t>
+                </m:r>
+                <m:r>
+                  <m:t>1</m:t>
+                </m:r>
+              </m:e>
+              <m:lim>
+                <m:r>
+                  <m:rPr>
+                    <m:sty m:val="p"/>
+                  </m:rPr>
+                  <m:t>⏟</m:t>
+                </m:r>
+              </m:lim>
+            </m:limLow>
+          </m:e>
+          <m:lim>
+            <m:r>
+              <m:t>n</m:t>
+            </m:r>
+          </m:lim>
+        </m:limLow>
+      </m:oMath>
+      <w:r>
+        <w:t xml:space="preserve"> </w:t>
+      </w:r>
+      <w:r>
+        <w:t xml:space="preserve">marta katta natural son mavjudligini isbotlang.</w:t>
+      </w:r>
+    </w:p>
+    <w:bookmarkEnd w:id="12"/>
+    <w:bookmarkStart w:id="13" w:name="bolinish"/>
+    <w:p>
+      <w:pPr>
+        <w:pStyle w:val="Heading2"/>
+      </w:pPr>
+      <w:r>
+        <w:t xml:space="preserve">1.3 Bo’linish</w:t>
+      </w:r>
+    </w:p>
+    <w:p>
+      <w:pPr>
+        <w:pStyle w:val="FirstParagraph"/>
+      </w:pPr>
+      <w:r>
+        <w:rPr>
+          <w:b/>
+          <w:bCs/>
+        </w:rPr>
+        <w:t xml:space="preserve">1.3.1.</w:t>
+      </w:r>
+      <w:r>
+        <w:t xml:space="preserve"> </w:t>
+      </w:r>
+      <w:r>
+        <w:t xml:space="preserve">(Butunrossiya, 2023, MB, 9.4)</w:t>
+      </w:r>
+      <w:r>
+        <w:t xml:space="preserve"> </w:t>
+      </w:r>
+      <m:oMath>
+        <m:r>
+          <m:t>p</m:t>
+        </m:r>
+      </m:oMath>
+      <w:r>
+        <w:t xml:space="preserve"> </w:t>
+      </w:r>
+      <w:r>
+        <w:t xml:space="preserve">tub son shunday ekanki,</w:t>
+      </w:r>
+      <w:r>
+        <w:t xml:space="preserve"> </w:t>
+      </w:r>
+      <m:oMath>
+        <m:r>
+          <m:t>p</m:t>
+        </m:r>
+        <m:r>
+          <m:rPr>
+            <m:sty m:val="p"/>
+          </m:rPr>
+          <m:t>+</m:t>
+        </m:r>
+        <m:r>
+          <m:t>25</m:t>
+        </m:r>
+      </m:oMath>
+      <w:r>
+        <w:t xml:space="preserve"> </w:t>
+      </w:r>
+      <w:r>
+        <w:t xml:space="preserve">soni biror tub sonning yettinchi darajasi.</w:t>
+      </w:r>
+      <w:r>
+        <w:t xml:space="preserve"> </w:t>
+      </w:r>
+      <m:oMath>
+        <m:r>
+          <m:t>p</m:t>
+        </m:r>
+      </m:oMath>
+      <w:r>
+        <w:t xml:space="preserve"> </w:t>
+      </w:r>
+      <w:r>
+        <w:t xml:space="preserve">nimaga teng bo’lishi mumkin? Barcha variantlarni ko’rsating.</w:t>
+      </w:r>
+    </w:p>
+    <w:p>
+      <w:pPr>
+        <w:pStyle w:val="BodyText"/>
+      </w:pPr>
+      <w:r>
+        <w:rPr>
+          <w:b/>
+          <w:bCs/>
+        </w:rPr>
+        <w:t xml:space="preserve">1.3.2.</w:t>
+      </w:r>
+      <w:r>
+        <w:t xml:space="preserve"> </w:t>
+      </w:r>
+      <w:r>
+        <w:t xml:space="preserve">(Butunrossiya, 2022, shahar bosqichi, 9.1) Natural</w:t>
+      </w:r>
+      <w:r>
+        <w:t xml:space="preserve"> </w:t>
+      </w:r>
+      <m:oMath>
+        <m:r>
+          <m:t>a</m:t>
+        </m:r>
+      </m:oMath>
+      <w:r>
+        <w:t xml:space="preserve"> </w:t>
+      </w:r>
+      <w:r>
+        <w:t xml:space="preserve">uchun</w:t>
+      </w:r>
+      <w:r>
+        <w:t xml:space="preserve"> </w:t>
+      </w:r>
+      <m:oMath>
+        <m:r>
+          <m:t>1</m:t>
+        </m:r>
+        <m:r>
+          <m:rPr>
+            <m:sty m:val="p"/>
+          </m:rPr>
+          <m:t>⋅</m:t>
+        </m:r>
+        <m:r>
+          <m:t>2</m:t>
+        </m:r>
+        <m:r>
+          <m:rPr>
+            <m:sty m:val="p"/>
+          </m:rPr>
+          <m:t>⋅</m:t>
+        </m:r>
+        <m:r>
+          <m:t>3</m:t>
+        </m:r>
+        <m:r>
+          <m:rPr>
+            <m:sty m:val="p"/>
+          </m:rPr>
+          <m:t>⋯</m:t>
+        </m:r>
+        <m:r>
+          <m:t>a</m:t>
+        </m:r>
+      </m:oMath>
+      <w:r>
+        <w:t xml:space="preserve"> </w:t>
+      </w:r>
+      <w:r>
+        <w:t xml:space="preserve">ko’paytma</w:t>
+      </w:r>
+      <w:r>
+        <w:t xml:space="preserve"> </w:t>
+      </w:r>
+      <m:oMath>
+        <m:r>
+          <m:t>a</m:t>
         </m:r>
         <m:r>
           <m:rPr>
@@ -601,85 +1691,126 @@
           </m:rPr>
           <m:t>!</m:t>
         </m:r>
+      </m:oMath>
+      <w:r>
+        <w:t xml:space="preserve"> </w:t>
+      </w:r>
+      <w:r>
+        <w:t xml:space="preserve">deb belgilanadi.</w:t>
+      </w:r>
+    </w:p>
+    <w:p>
+      <w:pPr>
+        <w:pStyle w:val="Compact"/>
+        <w:numPr>
+          <w:ilvl w:val="0"/>
+          <w:numId w:val="1001"/>
+        </w:numPr>
+      </w:pPr>
+      <m:oMath>
+        <m:r>
+          <m:t>m</m:t>
+        </m:r>
         <m:r>
           <m:rPr>
             <m:sty m:val="p"/>
           </m:rPr>
-          <m:t>=</m:t>
-        </m:r>
-        <m:r>
-          <m:t>1</m:t>
+          <m:t>!</m:t>
+        </m:r>
+      </m:oMath>
+      <w:r>
+        <w:t xml:space="preserve"> </w:t>
+      </w:r>
+      <w:r>
+        <w:t xml:space="preserve">soni</w:t>
+      </w:r>
+      <w:r>
+        <w:t xml:space="preserve"> </w:t>
+      </w:r>
+      <m:oMath>
+        <m:r>
+          <m:t>23</m:t>
+        </m:r>
+        <m:r>
+          <m:t>m</m:t>
+        </m:r>
+      </m:oMath>
+      <w:r>
+        <w:t xml:space="preserve"> </w:t>
+      </w:r>
+      <w:r>
+        <w:t xml:space="preserve">ga bo’linadigan eng kichik natural</w:t>
+      </w:r>
+      <w:r>
+        <w:t xml:space="preserve"> </w:t>
+      </w:r>
+      <m:oMath>
+        <m:r>
+          <m:t>m</m:t>
+        </m:r>
+      </m:oMath>
+      <w:r>
+        <w:t xml:space="preserve"> </w:t>
+      </w:r>
+      <w:r>
+        <w:t xml:space="preserve">ni toping.</w:t>
+      </w:r>
+    </w:p>
+    <w:p>
+      <w:pPr>
+        <w:pStyle w:val="Compact"/>
+        <w:numPr>
+          <w:ilvl w:val="0"/>
+          <w:numId w:val="1001"/>
+        </w:numPr>
+      </w:pPr>
+      <m:oMath>
+        <m:r>
+          <m:t>n</m:t>
         </m:r>
         <m:r>
           <m:rPr>
             <m:sty m:val="p"/>
           </m:rPr>
-          <m:t>⋅</m:t>
-        </m:r>
-        <m:r>
-          <m:t>2</m:t>
-        </m:r>
-        <m:r>
-          <m:rPr>
-            <m:sty m:val="p"/>
-          </m:rPr>
-          <m:t>⋅</m:t>
-        </m:r>
-        <m:r>
-          <m:t>3</m:t>
-        </m:r>
-        <m:r>
-          <m:rPr>
-            <m:sty m:val="p"/>
-          </m:rPr>
-          <m:t>⋯</m:t>
-        </m:r>
-        <m:r>
-          <m:rPr>
-            <m:sty m:val="p"/>
-          </m:rPr>
-          <m:t>(</m:t>
+          <m:t>!</m:t>
+        </m:r>
+      </m:oMath>
+      <w:r>
+        <w:t xml:space="preserve"> </w:t>
+      </w:r>
+      <w:r>
+        <w:t xml:space="preserve">soni</w:t>
+      </w:r>
+      <w:r>
+        <w:t xml:space="preserve"> </w:t>
+      </w:r>
+      <m:oMath>
+        <m:r>
+          <m:t>33</m:t>
         </m:r>
         <m:r>
           <m:t>n</m:t>
         </m:r>
-        <m:r>
-          <m:rPr>
-            <m:sty m:val="p"/>
-          </m:rPr>
-          <m:t>−</m:t>
-        </m:r>
-        <m:r>
-          <m:t>1</m:t>
-        </m:r>
-        <m:r>
-          <m:rPr>
-            <m:sty m:val="p"/>
-          </m:rPr>
-          <m:t>)</m:t>
-        </m:r>
-        <m:r>
-          <m:rPr>
-            <m:sty m:val="p"/>
-          </m:rPr>
-          <m:t>⋅</m:t>
-        </m:r>
+      </m:oMath>
+      <w:r>
+        <w:t xml:space="preserve"> </w:t>
+      </w:r>
+      <w:r>
+        <w:t xml:space="preserve">ga bo’linadigan eng kichik natural</w:t>
+      </w:r>
+      <w:r>
+        <w:t xml:space="preserve"> </w:t>
+      </w:r>
+      <m:oMath>
         <m:r>
           <m:t>n</m:t>
         </m:r>
       </m:oMath>
       <w:r>
-        <w:t xml:space="preserve">)</w:t>
-      </w:r>
-    </w:p>
-    <w:bookmarkEnd w:id="11"/>
-    <w:bookmarkStart w:id="12" w:name="bolinish"/>
-    <w:p>
-      <w:pPr>
-        <w:pStyle w:val="Heading2"/>
-      </w:pPr>
-      <w:r>
-        <w:t xml:space="preserve">1.3 Bo’linish</w:t>
+        <w:t xml:space="preserve"> </w:t>
+      </w:r>
+      <w:r>
+        <w:t xml:space="preserve">ni toping.</w:t>
       </w:r>
     </w:p>
     <w:p>
@@ -697,7 +1828,7 @@
         <w:t xml:space="preserve"> </w:t>
       </w:r>
       <w:r>
-        <w:t xml:space="preserve">Har qanday natural</w:t>
+        <w:t xml:space="preserve">(«Kelajak tadqiqotchilari — fan kelajagi», 2016, 9.1) Har qanday natural</w:t>
       </w:r>
       <w:r>
         <w:t xml:space="preserve"> </w:t>
@@ -777,495 +1908,6 @@
       </w:r>
       <w:r>
         <w:t xml:space="preserve">soni murakkab ekanini isbotlang.</w:t>
-      </w:r>
-    </w:p>
-    <w:p>
-      <w:pPr>
-        <w:pStyle w:val="BodyText"/>
-      </w:pPr>
-      <w:r>
-        <w:rPr>
-          <w:b/>
-          <w:bCs/>
-        </w:rPr>
-        <w:t xml:space="preserve">1.3.10.</w:t>
-      </w:r>
-      <w:r>
-        <w:t xml:space="preserve"> </w:t>
-      </w:r>
-      <m:oMath>
-        <m:r>
-          <m:t>1</m:t>
-        </m:r>
-        <m:r>
-          <m:rPr>
-            <m:sty m:val="p"/>
-          </m:rPr>
-          <m:t>+</m:t>
-        </m:r>
-        <m:f>
-          <m:fPr>
-            <m:type m:val="bar"/>
-          </m:fPr>
-          <m:num>
-            <m:r>
-              <m:t>1</m:t>
-            </m:r>
-          </m:num>
-          <m:den>
-            <m:r>
-              <m:t>2</m:t>
-            </m:r>
-          </m:den>
-        </m:f>
-        <m:r>
-          <m:rPr>
-            <m:sty m:val="p"/>
-          </m:rPr>
-          <m:t>+</m:t>
-        </m:r>
-        <m:f>
-          <m:fPr>
-            <m:type m:val="bar"/>
-          </m:fPr>
-          <m:num>
-            <m:r>
-              <m:t>1</m:t>
-            </m:r>
-          </m:num>
-          <m:den>
-            <m:r>
-              <m:t>3</m:t>
-            </m:r>
-          </m:den>
-        </m:f>
-        <m:r>
-          <m:rPr>
-            <m:sty m:val="p"/>
-          </m:rPr>
-          <m:t>+</m:t>
-        </m:r>
-        <m:r>
-          <m:rPr>
-            <m:sty m:val="p"/>
-          </m:rPr>
-          <m:t>…</m:t>
-        </m:r>
-        <m:r>
-          <m:rPr>
-            <m:sty m:val="p"/>
-          </m:rPr>
-          <m:t>+</m:t>
-        </m:r>
-        <m:f>
-          <m:fPr>
-            <m:type m:val="bar"/>
-          </m:fPr>
-          <m:num>
-            <m:r>
-              <m:t>1</m:t>
-            </m:r>
-          </m:num>
-          <m:den>
-            <m:r>
-              <m:t>346</m:t>
-            </m:r>
-          </m:den>
-        </m:f>
-      </m:oMath>
-      <w:r>
-        <w:t xml:space="preserve"> </w:t>
-      </w:r>
-      <w:r>
-        <w:t xml:space="preserve">yig’indi surati</w:t>
-      </w:r>
-      <w:r>
-        <w:t xml:space="preserve"> </w:t>
-      </w:r>
-      <m:oMath>
-        <m:r>
-          <m:t>347</m:t>
-        </m:r>
-      </m:oMath>
-      <w:r>
-        <w:t xml:space="preserve"> </w:t>
-      </w:r>
-      <w:r>
-        <w:t xml:space="preserve">ga bo’linadigan kasr ekanini isbotlang.</w:t>
-      </w:r>
-    </w:p>
-    <w:bookmarkEnd w:id="12"/>
-    <w:bookmarkStart w:id="13" w:name="ekub-va-ekuk"/>
-    <w:p>
-      <w:pPr>
-        <w:pStyle w:val="Heading2"/>
-      </w:pPr>
-      <w:r>
-        <w:t xml:space="preserve">1.4 EKUB va EKUK</w:t>
-      </w:r>
-    </w:p>
-    <w:p>
-      <w:pPr>
-        <w:pStyle w:val="FirstParagraph"/>
-      </w:pPr>
-      <w:r>
-        <w:rPr>
-          <w:b/>
-          <w:bCs/>
-        </w:rPr>
-        <w:t xml:space="preserve">1.4.1.</w:t>
-      </w:r>
-      <w:r>
-        <w:t xml:space="preserve"> </w:t>
-      </w:r>
-      <w:r>
-        <w:t xml:space="preserve">Vanya ko’paytmasi</w:t>
-      </w:r>
-      <w:r>
-        <w:t xml:space="preserve"> </w:t>
-      </w:r>
-      <m:oMath>
-        <m:r>
-          <m:t>7200</m:t>
-        </m:r>
-      </m:oMath>
-      <w:r>
-        <w:t xml:space="preserve"> </w:t>
-      </w:r>
-      <w:r>
-        <w:t xml:space="preserve">bo’lgan ikkita natural son o’yladi. Bu sonlarning EKUBi eng ko’pi bilan nechaga teng bo’lishi mumkin?</w:t>
-      </w:r>
-    </w:p>
-    <w:p>
-      <w:pPr>
-        <w:pStyle w:val="BodyText"/>
-      </w:pPr>
-      <w:r>
-        <w:rPr>
-          <w:b/>
-          <w:bCs/>
-        </w:rPr>
-        <w:t xml:space="preserve">1.4.5.</w:t>
-      </w:r>
-      <w:r>
-        <w:t xml:space="preserve"> </w:t>
-      </w:r>
-      <m:oMath>
-        <m:f>
-          <m:fPr>
-            <m:type m:val="bar"/>
-          </m:fPr>
-          <m:num>
-            <m:r>
-              <m:t>a</m:t>
-            </m:r>
-          </m:num>
-          <m:den>
-            <m:r>
-              <m:t>b</m:t>
-            </m:r>
-          </m:den>
-        </m:f>
-      </m:oMath>
-      <w:r>
-        <w:t xml:space="preserve"> </w:t>
-      </w:r>
-      <w:r>
-        <w:t xml:space="preserve">kasr qisqarmas (</w:t>
-      </w:r>
-      <m:oMath>
-        <m:r>
-          <m:t>a</m:t>
-        </m:r>
-        <m:r>
-          <m:rPr>
-            <m:sty m:val="p"/>
-          </m:rPr>
-          <m:t>,</m:t>
-        </m:r>
-        <m:r>
-          <m:t>b</m:t>
-        </m:r>
-        <m:r>
-          <m:rPr>
-            <m:sty m:val="p"/>
-          </m:rPr>
-          <m:t>∈</m:t>
-        </m:r>
-        <m:r>
-          <m:rPr>
-            <m:scr m:val="double-struck"/>
-            <m:sty m:val="p"/>
-          </m:rPr>
-          <m:t>N</m:t>
-        </m:r>
-      </m:oMath>
-      <w:r>
-        <w:t xml:space="preserve">). Doskada</w:t>
-      </w:r>
-    </w:p>
-    <w:p>
-      <w:pPr>
-        <w:pStyle w:val="BodyText"/>
-      </w:pPr>
-      <m:oMathPara>
-        <m:oMathParaPr>
-          <m:jc m:val="center"/>
-        </m:oMathParaPr>
-        <m:oMath>
-          <m:f>
-            <m:fPr>
-              <m:type m:val="bar"/>
-            </m:fPr>
-            <m:num>
-              <m:r>
-                <m:t>a</m:t>
-              </m:r>
-              <m:r>
-                <m:rPr>
-                  <m:sty m:val="p"/>
-                </m:rPr>
-                <m:t>+</m:t>
-              </m:r>
-              <m:r>
-                <m:t>b</m:t>
-              </m:r>
-            </m:num>
-            <m:den>
-              <m:sSup>
-                <m:e>
-                  <m:r>
-                    <m:t>a</m:t>
-                  </m:r>
-                </m:e>
-                <m:sup>
-                  <m:r>
-                    <m:t>2</m:t>
-                  </m:r>
-                </m:sup>
-              </m:sSup>
-              <m:r>
-                <m:rPr>
-                  <m:sty m:val="p"/>
-                </m:rPr>
-                <m:t>−</m:t>
-              </m:r>
-              <m:r>
-                <m:t>8</m:t>
-              </m:r>
-              <m:r>
-                <m:t>a</m:t>
-              </m:r>
-              <m:r>
-                <m:t>b</m:t>
-              </m:r>
-              <m:r>
-                <m:rPr>
-                  <m:sty m:val="p"/>
-                </m:rPr>
-                <m:t>+</m:t>
-              </m:r>
-              <m:sSup>
-                <m:e>
-                  <m:r>
-                    <m:t>b</m:t>
-                  </m:r>
-                </m:e>
-                <m:sup>
-                  <m:r>
-                    <m:t>2</m:t>
-                  </m:r>
-                </m:sup>
-              </m:sSup>
-            </m:den>
-          </m:f>
-        </m:oMath>
-      </m:oMathPara>
-    </w:p>
-    <w:p>
-      <w:pPr>
-        <w:pStyle w:val="FirstParagraph"/>
-      </w:pPr>
-      <w:r>
-        <w:t xml:space="preserve">kasr yozilgan. Surat va maxrajni</w:t>
-      </w:r>
-      <w:r>
-        <w:t xml:space="preserve"> </w:t>
-      </w:r>
-      <m:oMath>
-        <m:r>
-          <m:t>m</m:t>
-        </m:r>
-      </m:oMath>
-      <w:r>
-        <w:t xml:space="preserve"> </w:t>
-      </w:r>
-      <w:r>
-        <w:t xml:space="preserve">ga qisqartirish mumkin bo’lishi uchun</w:t>
-      </w:r>
-      <w:r>
-        <w:t xml:space="preserve"> </w:t>
-      </w:r>
-      <m:oMath>
-        <m:r>
-          <m:t>m</m:t>
-        </m:r>
-      </m:oMath>
-      <w:r>
-        <w:t xml:space="preserve"> </w:t>
-      </w:r>
-      <w:r>
-        <w:t xml:space="preserve">eng ko’pi bilan nechaga teng?</w:t>
-      </w:r>
-    </w:p>
-    <w:p>
-      <w:pPr>
-        <w:pStyle w:val="BodyText"/>
-      </w:pPr>
-      <w:r>
-        <w:rPr>
-          <w:b/>
-          <w:bCs/>
-        </w:rPr>
-        <w:t xml:space="preserve">1.4.6.</w:t>
-      </w:r>
-      <w:r>
-        <w:t xml:space="preserve"> </w:t>
-      </w:r>
-      <m:oMath>
-        <m:r>
-          <m:rPr>
-            <m:sty m:val="p"/>
-          </m:rPr>
-          <m:t>EKUK</m:t>
-        </m:r>
-        <m:r>
-          <m:rPr>
-            <m:sty m:val="p"/>
-          </m:rPr>
-          <m:t>(</m:t>
-        </m:r>
-        <m:r>
-          <m:t>m</m:t>
-        </m:r>
-        <m:r>
-          <m:rPr>
-            <m:sty m:val="p"/>
-          </m:rPr>
-          <m:t>,</m:t>
-        </m:r>
-        <m:r>
-          <m:t>n</m:t>
-        </m:r>
-        <m:r>
-          <m:rPr>
-            <m:sty m:val="p"/>
-          </m:rPr>
-          <m:t>)</m:t>
-        </m:r>
-        <m:r>
-          <m:rPr>
-            <m:sty m:val="p"/>
-          </m:rPr>
-          <m:t>−</m:t>
-        </m:r>
-        <m:r>
-          <m:t>2</m:t>
-        </m:r>
-        <m:r>
-          <m:rPr>
-            <m:sty m:val="p"/>
-          </m:rPr>
-          <m:t>⋅</m:t>
-        </m:r>
-        <m:r>
-          <m:rPr>
-            <m:sty m:val="p"/>
-          </m:rPr>
-          <m:t>EKUB</m:t>
-        </m:r>
-        <m:r>
-          <m:rPr>
-            <m:sty m:val="p"/>
-          </m:rPr>
-          <m:t>(</m:t>
-        </m:r>
-        <m:r>
-          <m:t>m</m:t>
-        </m:r>
-        <m:r>
-          <m:rPr>
-            <m:sty m:val="p"/>
-          </m:rPr>
-          <m:t>,</m:t>
-        </m:r>
-        <m:r>
-          <m:t>n</m:t>
-        </m:r>
-        <m:r>
-          <m:rPr>
-            <m:sty m:val="p"/>
-          </m:rPr>
-          <m:t>)</m:t>
-        </m:r>
-        <m:r>
-          <m:rPr>
-            <m:sty m:val="p"/>
-          </m:rPr>
-          <m:t>=</m:t>
-        </m:r>
-        <m:f>
-          <m:fPr>
-            <m:type m:val="bar"/>
-          </m:fPr>
-          <m:num>
-            <m:r>
-              <m:t>5</m:t>
-            </m:r>
-            <m:r>
-              <m:t>m</m:t>
-            </m:r>
-            <m:r>
-              <m:t>n</m:t>
-            </m:r>
-          </m:num>
-          <m:den>
-            <m:r>
-              <m:t>7</m:t>
-            </m:r>
-          </m:den>
-        </m:f>
-      </m:oMath>
-      <w:r>
-        <w:t xml:space="preserve"> </w:t>
-      </w:r>
-      <w:r>
-        <w:t xml:space="preserve">tenglikni qanoatlantiradigan natural</w:t>
-      </w:r>
-      <w:r>
-        <w:t xml:space="preserve"> </w:t>
-      </w:r>
-      <m:oMath>
-        <m:r>
-          <m:t>m</m:t>
-        </m:r>
-      </m:oMath>
-      <w:r>
-        <w:t xml:space="preserve">,</w:t>
-      </w:r>
-      <w:r>
-        <w:t xml:space="preserve"> </w:t>
-      </w:r>
-      <m:oMath>
-        <m:r>
-          <m:t>n</m:t>
-        </m:r>
-      </m:oMath>
-      <w:r>
-        <w:t xml:space="preserve"> </w:t>
-      </w:r>
-      <w:r>
-        <w:t xml:space="preserve">juftliklarini toping.</w:t>
       </w:r>
     </w:p>
     <w:bookmarkEnd w:id="13"/>
@@ -1380,8 +2022,123 @@
       </w:pPr>
     </w:lvl>
   </w:abstractNum>
+  <w:abstractNum w:abstractNumId="99411">
+    <w:nsid w:val="00A99411"/>
+    <w:multiLevelType w:val="multilevel"/>
+    <w:lvl w:ilvl="0">
+      <w:start w:val="1"/>
+      <w:numFmt w:val="decimal"/>
+      <w:lvlText w:val="%1."/>
+      <w:lvlJc w:val="left"/>
+      <w:pPr>
+        <w:ind w:left="720" w:hanging="360"/>
+      </w:pPr>
+    </w:lvl>
+    <w:lvl w:ilvl="1">
+      <w:start w:val="1"/>
+      <w:numFmt w:val="decimal"/>
+      <w:lvlText w:val="%2."/>
+      <w:lvlJc w:val="left"/>
+      <w:pPr>
+        <w:ind w:left="1440" w:hanging="360"/>
+      </w:pPr>
+    </w:lvl>
+    <w:lvl w:ilvl="2">
+      <w:start w:val="1"/>
+      <w:numFmt w:val="decimal"/>
+      <w:lvlText w:val="%3."/>
+      <w:lvlJc w:val="left"/>
+      <w:pPr>
+        <w:ind w:left="2160" w:hanging="360"/>
+      </w:pPr>
+    </w:lvl>
+    <w:lvl w:ilvl="3">
+      <w:start w:val="1"/>
+      <w:numFmt w:val="decimal"/>
+      <w:lvlText w:val="%4."/>
+      <w:lvlJc w:val="left"/>
+      <w:pPr>
+        <w:ind w:left="2880" w:hanging="360"/>
+      </w:pPr>
+    </w:lvl>
+    <w:lvl w:ilvl="4">
+      <w:start w:val="1"/>
+      <w:numFmt w:val="decimal"/>
+      <w:lvlText w:val="%5."/>
+      <w:lvlJc w:val="left"/>
+      <w:pPr>
+        <w:ind w:left="3600" w:hanging="360"/>
+      </w:pPr>
+    </w:lvl>
+    <w:lvl w:ilvl="5">
+      <w:start w:val="1"/>
+      <w:numFmt w:val="decimal"/>
+      <w:lvlText w:val="%6."/>
+      <w:lvlJc w:val="left"/>
+      <w:pPr>
+        <w:ind w:left="4320" w:hanging="360"/>
+      </w:pPr>
+    </w:lvl>
+    <w:lvl w:ilvl="6">
+      <w:start w:val="1"/>
+      <w:numFmt w:val="decimal"/>
+      <w:lvlText w:val="%7."/>
+      <w:lvlJc w:val="left"/>
+      <w:pPr>
+        <w:ind w:left="5040" w:hanging="360"/>
+      </w:pPr>
+    </w:lvl>
+    <w:lvl w:ilvl="7">
+      <w:start w:val="1"/>
+      <w:numFmt w:val="decimal"/>
+      <w:lvlText w:val="%8."/>
+      <w:lvlJc w:val="left"/>
+      <w:pPr>
+        <w:ind w:left="5760" w:hanging="360"/>
+      </w:pPr>
+    </w:lvl>
+    <w:lvl w:ilvl="8">
+      <w:start w:val="1"/>
+      <w:numFmt w:val="decimal"/>
+      <w:lvlText w:val="%9."/>
+      <w:lvlJc w:val="left"/>
+      <w:pPr>
+        <w:ind w:left="6480" w:hanging="360"/>
+      </w:pPr>
+    </w:lvl>
+  </w:abstractNum>
   <w:num w:numId="1000">
     <w:abstractNumId w:val="990"/>
+  </w:num>
+  <w:num w:numId="1001">
+    <w:abstractNumId w:val="99411"/>
+    <w:lvlOverride w:ilvl="0">
+      <w:startOverride w:val="1"/>
+    </w:lvlOverride>
+    <w:lvlOverride w:ilvl="1">
+      <w:startOverride w:val="1"/>
+    </w:lvlOverride>
+    <w:lvlOverride w:ilvl="2">
+      <w:startOverride w:val="1"/>
+    </w:lvlOverride>
+    <w:lvlOverride w:ilvl="3">
+      <w:startOverride w:val="1"/>
+    </w:lvlOverride>
+    <w:lvlOverride w:ilvl="4">
+      <w:startOverride w:val="1"/>
+    </w:lvlOverride>
+    <w:lvlOverride w:ilvl="5">
+      <w:startOverride w:val="1"/>
+    </w:lvlOverride>
+    <w:lvlOverride w:ilvl="6">
+      <w:startOverride w:val="1"/>
+    </w:lvlOverride>
+    <w:lvlOverride w:ilvl="7">
+      <w:startOverride w:val="1"/>
+    </w:lvlOverride>
+    <w:lvlOverride w:ilvl="8">
+      <w:startOverride w:val="1"/>
+    </w:lvlOverride>
   </w:num>
 </w:numbering>
 </file>

</xml_diff>